<commit_message>
regen(r3b1): N1/N6/N7 nested-grid rebuild + role flips L1FIX round 2
- PLI_M02/M12/M15: glue header nguoi/dai dien -> w:tbl loop that
  (ds_nddpl_uy_quyen_chu_so_huu / ds_ndd_uy_quyen_sau_thay_doi /
  ds_nddpl_uy_quyen_chu_so_huu_moi) theo specs D2.1/D2.4/D2.7; 2 nhom cot
  cuoi van KHAI THIEU (chua du evidence canonical tag).
- PLII_M02/M07/M14, PLI_M23/M28/M63: role body->section-heading (L1FIX
  round 2 override, merge 7300ab4).
- form_maps.js/json: section_specs cho 3 loop moi.
Zero-diff RUN2 (JSON strict); 84 template con lai member-identical, da
restore ve HEAD giu batch dung scope evidence.

Co-Authored-By: Claude <noreply@anthropic.com>
</commit_message>
<xml_diff>
--- a/app/templates/PLI_M02.docx
+++ b/app/templates/PLI_M02.docx
@@ -3076,6 +3076,937 @@
         <w:t xml:space="preserve">- Thông tin về người đại diện theo pháp luật/người đại diện theo ủy quyền của chủ sở hữu:</w:t>
       </w:r>
     </w:p>
+    <w:tbl xmlns:ns0="urn:orca:p1b-temp">
+      <w:tblPr>
+        <w:tblW w:type="auto" w:w="0"/>
+        <w:tblLook w:firstColumn="1" w:firstRow="1" w:lastColumn="0" w:lastRow="0" w:noHBand="0" w:noVBand="1" w:val="04A0"/>
+        <w:tblBorders>
+          <w:top w:val="single" w:sz="4" w:color="000000"/>
+          <w:left w:val="single" w:sz="4" w:color="000000"/>
+          <w:bottom w:val="single" w:sz="4" w:color="000000"/>
+          <w:right w:val="single" w:sz="4" w:color="000000"/>
+          <w:insideH w:val="single" w:sz="4" w:color="000000"/>
+          <w:insideV w:val="single" w:sz="4" w:color="000000"/>
+        </w:tblBorders>
+      </w:tblPr>
+      <w:tblGrid>
+        <w:gridCol w:w="617"/>
+        <w:gridCol w:w="617"/>
+        <w:gridCol w:w="617"/>
+        <w:gridCol w:w="617"/>
+        <w:gridCol w:w="617"/>
+        <w:gridCol w:w="617"/>
+        <w:gridCol w:w="617"/>
+        <w:gridCol w:w="617"/>
+        <w:gridCol w:w="617"/>
+        <w:gridCol w:w="617"/>
+        <w:gridCol w:w="617"/>
+        <w:gridCol w:w="617"/>
+        <w:gridCol w:w="617"/>
+        <w:gridCol w:w="617"/>
+      </w:tblGrid>
+      <w:tr>
+        <w:tc>
+          <w:tcPr>
+            <w:tcW w:type="dxa" w:w="617"/>
+            <w:vMerge w:val="restart"/>
+          </w:tcPr>
+          <w:p>
+            <w:r>
+              <w:rPr>
+                <w:b/>
+              </w:rPr>
+              <w:t>STT</w:t>
+            </w:r>
+          </w:p>
+        </w:tc>
+        <w:tc>
+          <w:tcPr>
+            <w:tcW w:type="dxa" w:w="617"/>
+            <w:vMerge w:val="restart"/>
+          </w:tcPr>
+          <w:p>
+            <w:r>
+              <w:rPr>
+                <w:b/>
+              </w:rPr>
+              <w:t>Tên người đại diện theo pháp luật/người đại diện theo ủy quyền</w:t>
+            </w:r>
+          </w:p>
+        </w:tc>
+        <w:tc>
+          <w:tcPr>
+            <w:tcW w:type="dxa" w:w="617"/>
+            <w:vMerge w:val="restart"/>
+          </w:tcPr>
+          <w:p>
+            <w:r>
+              <w:rPr>
+                <w:b/>
+              </w:rPr>
+              <w:t>Ngày, tháng, năm sinh</w:t>
+            </w:r>
+          </w:p>
+        </w:tc>
+        <w:tc>
+          <w:tcPr>
+            <w:tcW w:type="dxa" w:w="617"/>
+            <w:vMerge w:val="restart"/>
+          </w:tcPr>
+          <w:p>
+            <w:r>
+              <w:rPr>
+                <w:b/>
+              </w:rPr>
+              <w:t>Giới tính</w:t>
+            </w:r>
+          </w:p>
+        </w:tc>
+        <w:tc>
+          <w:tcPr>
+            <w:tcW w:type="dxa" w:w="1851"/>
+            <w:gridSpan w:val="3"/>
+          </w:tcPr>
+          <w:p>
+            <w:r>
+              <w:rPr>
+                <w:b/>
+              </w:rPr>
+              <w:t>Số, ngày cấp, cơ quan cấp Giấy tờ pháp lý của cá nhân</w:t>
+            </w:r>
+          </w:p>
+        </w:tc>
+        <w:tc>
+          <w:tcPr>
+            <w:tcW w:type="dxa" w:w="617"/>
+            <w:vMerge w:val="restart"/>
+          </w:tcPr>
+          <w:p>
+            <w:r>
+              <w:rPr>
+                <w:b/>
+              </w:rPr>
+              <w:t>Quốc tịch</w:t>
+            </w:r>
+          </w:p>
+        </w:tc>
+        <w:tc>
+          <w:tcPr>
+            <w:tcW w:type="dxa" w:w="617"/>
+            <w:vMerge w:val="restart"/>
+          </w:tcPr>
+          <w:p>
+            <w:r>
+              <w:rPr>
+                <w:b/>
+              </w:rPr>
+              <w:t>Dân tộc</w:t>
+            </w:r>
+          </w:p>
+        </w:tc>
+        <w:tc>
+          <w:tcPr>
+            <w:tcW w:type="dxa" w:w="617"/>
+            <w:vMerge w:val="restart"/>
+          </w:tcPr>
+          <w:p>
+            <w:r>
+              <w:rPr>
+                <w:b/>
+              </w:rPr>
+              <w:t>Địa chỉ liên lạc</w:t>
+            </w:r>
+          </w:p>
+        </w:tc>
+        <w:tc>
+          <w:tcPr>
+            <w:tcW w:type="dxa" w:w="1234"/>
+            <w:gridSpan w:val="2"/>
+          </w:tcPr>
+          <w:p>
+            <w:r>
+              <w:rPr>
+                <w:b/>
+              </w:rPr>
+              <w:t>Vốn được ủy quyền</w:t>
+            </w:r>
+          </w:p>
+        </w:tc>
+        <w:tc>
+          <w:tcPr>
+            <w:tcW w:type="dxa" w:w="617"/>
+            <w:vMerge w:val="restart"/>
+          </w:tcPr>
+          <w:p>
+            <w:r>
+              <w:rPr>
+                <w:b/>
+              </w:rPr>
+              <w:t>Chữ ký của người đại diện theo pháp luật/người đại diện theo ủy quyền</w:t>
+            </w:r>
+          </w:p>
+        </w:tc>
+        <w:tc>
+          <w:tcPr>
+            <w:tcW w:type="dxa" w:w="617"/>
+            <w:vMerge w:val="restart"/>
+          </w:tcPr>
+          <w:p>
+            <w:r>
+              <w:rPr>
+                <w:b/>
+              </w:rPr>
+              <w:t>Ghi chú (nếu có)</w:t>
+            </w:r>
+          </w:p>
+        </w:tc>
+      </w:tr>
+      <w:tr>
+        <w:tc>
+          <w:tcPr>
+            <w:tcW w:type="dxa" w:w="617"/>
+            <w:vMerge/>
+          </w:tcPr>
+          <w:p/>
+        </w:tc>
+        <w:tc>
+          <w:tcPr>
+            <w:tcW w:type="dxa" w:w="617"/>
+            <w:vMerge/>
+          </w:tcPr>
+          <w:p/>
+        </w:tc>
+        <w:tc>
+          <w:tcPr>
+            <w:tcW w:type="dxa" w:w="617"/>
+            <w:vMerge/>
+          </w:tcPr>
+          <w:p/>
+        </w:tc>
+        <w:tc>
+          <w:tcPr>
+            <w:tcW w:type="dxa" w:w="617"/>
+            <w:vMerge/>
+          </w:tcPr>
+          <w:p/>
+        </w:tc>
+        <w:tc>
+          <w:tcPr>
+            <w:tcW w:type="dxa" w:w="617"/>
+          </w:tcPr>
+          <w:p>
+            <w:r>
+              <w:rPr>
+                <w:b/>
+              </w:rPr>
+              <w:t>Số</w:t>
+            </w:r>
+          </w:p>
+        </w:tc>
+        <w:tc>
+          <w:tcPr>
+            <w:tcW w:type="dxa" w:w="617"/>
+          </w:tcPr>
+          <w:p>
+            <w:r>
+              <w:rPr>
+                <w:b/>
+              </w:rPr>
+              <w:t>Ngày cấp</w:t>
+            </w:r>
+          </w:p>
+        </w:tc>
+        <w:tc>
+          <w:tcPr>
+            <w:tcW w:type="dxa" w:w="617"/>
+          </w:tcPr>
+          <w:p>
+            <w:r>
+              <w:rPr>
+                <w:b/>
+              </w:rPr>
+              <w:t>Cơ quan cấp</w:t>
+            </w:r>
+          </w:p>
+        </w:tc>
+        <w:tc>
+          <w:tcPr>
+            <w:tcW w:type="dxa" w:w="617"/>
+            <w:vMerge/>
+          </w:tcPr>
+          <w:p/>
+        </w:tc>
+        <w:tc>
+          <w:tcPr>
+            <w:tcW w:type="dxa" w:w="617"/>
+            <w:vMerge/>
+          </w:tcPr>
+          <w:p/>
+        </w:tc>
+        <w:tc>
+          <w:tcPr>
+            <w:tcW w:type="dxa" w:w="617"/>
+            <w:vMerge/>
+          </w:tcPr>
+          <w:p/>
+        </w:tc>
+        <w:tc>
+          <w:tcPr>
+            <w:tcW w:type="dxa" w:w="617"/>
+          </w:tcPr>
+          <w:p>
+            <w:r>
+              <w:rPr>
+                <w:b/>
+              </w:rPr>
+              <w:t>VNĐ</w:t>
+            </w:r>
+          </w:p>
+        </w:tc>
+        <w:tc>
+          <w:tcPr>
+            <w:tcW w:type="dxa" w:w="617"/>
+          </w:tcPr>
+          <w:p>
+            <w:r>
+              <w:rPr>
+                <w:b/>
+              </w:rPr>
+              <w:t>Tỷ lệ (%)</w:t>
+            </w:r>
+          </w:p>
+        </w:tc>
+        <w:tc>
+          <w:tcPr>
+            <w:tcW w:type="dxa" w:w="617"/>
+            <w:vMerge/>
+          </w:tcPr>
+          <w:p/>
+        </w:tc>
+        <w:tc>
+          <w:tcPr>
+            <w:tcW w:type="dxa" w:w="617"/>
+            <w:vMerge/>
+          </w:tcPr>
+          <w:p/>
+        </w:tc>
+      </w:tr>
+      <w:tr>
+        <w:tc>
+          <w:tcPr>
+            <w:tcW w:type="dxa" w:w="617"/>
+          </w:tcPr>
+          <w:p/>
+        </w:tc>
+        <w:tc>
+          <w:tcPr>
+            <w:tcW w:type="dxa" w:w="617"/>
+          </w:tcPr>
+          <w:p/>
+        </w:tc>
+        <w:tc>
+          <w:tcPr>
+            <w:tcW w:type="dxa" w:w="617"/>
+          </w:tcPr>
+          <w:p/>
+        </w:tc>
+        <w:tc>
+          <w:tcPr>
+            <w:tcW w:type="dxa" w:w="617"/>
+          </w:tcPr>
+          <w:p/>
+        </w:tc>
+        <w:tc>
+          <w:tcPr>
+            <w:tcW w:type="dxa" w:w="617"/>
+          </w:tcPr>
+          <w:p/>
+        </w:tc>
+        <w:tc>
+          <w:tcPr>
+            <w:tcW w:type="dxa" w:w="617"/>
+          </w:tcPr>
+          <w:p/>
+        </w:tc>
+        <w:tc>
+          <w:tcPr>
+            <w:tcW w:type="dxa" w:w="617"/>
+          </w:tcPr>
+          <w:p/>
+        </w:tc>
+        <w:tc>
+          <w:tcPr>
+            <w:tcW w:type="dxa" w:w="617"/>
+          </w:tcPr>
+          <w:p/>
+        </w:tc>
+        <w:tc>
+          <w:tcPr>
+            <w:tcW w:type="dxa" w:w="617"/>
+          </w:tcPr>
+          <w:p/>
+        </w:tc>
+        <w:tc>
+          <w:tcPr>
+            <w:tcW w:type="dxa" w:w="617"/>
+          </w:tcPr>
+          <w:p/>
+        </w:tc>
+        <w:tc>
+          <w:tcPr>
+            <w:tcW w:type="dxa" w:w="617"/>
+          </w:tcPr>
+          <w:p/>
+        </w:tc>
+        <w:tc>
+          <w:tcPr>
+            <w:tcW w:type="dxa" w:w="617"/>
+          </w:tcPr>
+          <w:p/>
+        </w:tc>
+        <w:tc>
+          <w:tcPr>
+            <w:tcW w:type="dxa" w:w="617"/>
+          </w:tcPr>
+          <w:p/>
+        </w:tc>
+        <w:tc>
+          <w:tcPr>
+            <w:tcW w:type="dxa" w:w="617"/>
+          </w:tcPr>
+          <w:p/>
+        </w:tc>
+      </w:tr>
+      <w:tr>
+        <w:tc>
+          <w:tcPr>
+            <w:tcW w:type="dxa" w:w="617"/>
+          </w:tcPr>
+          <w:p/>
+        </w:tc>
+        <w:tc>
+          <w:tcPr>
+            <w:tcW w:type="dxa" w:w="617"/>
+          </w:tcPr>
+          <w:p/>
+        </w:tc>
+        <w:tc>
+          <w:tcPr>
+            <w:tcW w:type="dxa" w:w="617"/>
+          </w:tcPr>
+          <w:p/>
+        </w:tc>
+        <w:tc>
+          <w:tcPr>
+            <w:tcW w:type="dxa" w:w="617"/>
+          </w:tcPr>
+          <w:p/>
+        </w:tc>
+        <w:tc>
+          <w:tcPr>
+            <w:tcW w:type="dxa" w:w="617"/>
+          </w:tcPr>
+          <w:p/>
+        </w:tc>
+        <w:tc>
+          <w:tcPr>
+            <w:tcW w:type="dxa" w:w="617"/>
+          </w:tcPr>
+          <w:p/>
+        </w:tc>
+        <w:tc>
+          <w:tcPr>
+            <w:tcW w:type="dxa" w:w="617"/>
+          </w:tcPr>
+          <w:p/>
+        </w:tc>
+        <w:tc>
+          <w:tcPr>
+            <w:tcW w:type="dxa" w:w="617"/>
+          </w:tcPr>
+          <w:p/>
+        </w:tc>
+        <w:tc>
+          <w:tcPr>
+            <w:tcW w:type="dxa" w:w="617"/>
+          </w:tcPr>
+          <w:p/>
+        </w:tc>
+        <w:tc>
+          <w:tcPr>
+            <w:tcW w:type="dxa" w:w="617"/>
+          </w:tcPr>
+          <w:p/>
+        </w:tc>
+        <w:tc>
+          <w:tcPr>
+            <w:tcW w:type="dxa" w:w="617"/>
+          </w:tcPr>
+          <w:p/>
+        </w:tc>
+        <w:tc>
+          <w:tcPr>
+            <w:tcW w:type="dxa" w:w="617"/>
+          </w:tcPr>
+          <w:p/>
+        </w:tc>
+        <w:tc>
+          <w:tcPr>
+            <w:tcW w:type="dxa" w:w="617"/>
+          </w:tcPr>
+          <w:p/>
+        </w:tc>
+        <w:tc>
+          <w:tcPr>
+            <w:tcW w:type="dxa" w:w="617"/>
+          </w:tcPr>
+          <w:p/>
+        </w:tc>
+      </w:tr>
+      <w:tr>
+        <w:tc>
+          <w:tcPr>
+            <w:tcW w:type="dxa" w:w="617"/>
+          </w:tcPr>
+          <w:p/>
+        </w:tc>
+        <w:tc>
+          <w:tcPr>
+            <w:tcW w:type="dxa" w:w="617"/>
+          </w:tcPr>
+          <w:p/>
+        </w:tc>
+        <w:tc>
+          <w:tcPr>
+            <w:tcW w:type="dxa" w:w="617"/>
+          </w:tcPr>
+          <w:p/>
+        </w:tc>
+        <w:tc>
+          <w:tcPr>
+            <w:tcW w:type="dxa" w:w="617"/>
+          </w:tcPr>
+          <w:p/>
+        </w:tc>
+        <w:tc>
+          <w:tcPr>
+            <w:tcW w:type="dxa" w:w="617"/>
+          </w:tcPr>
+          <w:p/>
+        </w:tc>
+        <w:tc>
+          <w:tcPr>
+            <w:tcW w:type="dxa" w:w="617"/>
+          </w:tcPr>
+          <w:p/>
+        </w:tc>
+        <w:tc>
+          <w:tcPr>
+            <w:tcW w:type="dxa" w:w="617"/>
+          </w:tcPr>
+          <w:p/>
+        </w:tc>
+        <w:tc>
+          <w:tcPr>
+            <w:tcW w:type="dxa" w:w="617"/>
+          </w:tcPr>
+          <w:p/>
+        </w:tc>
+        <w:tc>
+          <w:tcPr>
+            <w:tcW w:type="dxa" w:w="617"/>
+          </w:tcPr>
+          <w:p/>
+        </w:tc>
+        <w:tc>
+          <w:tcPr>
+            <w:tcW w:type="dxa" w:w="617"/>
+          </w:tcPr>
+          <w:p/>
+        </w:tc>
+        <w:tc>
+          <w:tcPr>
+            <w:tcW w:type="dxa" w:w="617"/>
+          </w:tcPr>
+          <w:p/>
+        </w:tc>
+        <w:tc>
+          <w:tcPr>
+            <w:tcW w:type="dxa" w:w="617"/>
+          </w:tcPr>
+          <w:p/>
+        </w:tc>
+        <w:tc>
+          <w:tcPr>
+            <w:tcW w:type="dxa" w:w="617"/>
+          </w:tcPr>
+          <w:p/>
+        </w:tc>
+        <w:tc>
+          <w:tcPr>
+            <w:tcW w:type="dxa" w:w="617"/>
+          </w:tcPr>
+          <w:p/>
+        </w:tc>
+      </w:tr>
+      <w:tr>
+        <w:tc>
+          <w:tcPr>
+            <w:tcW w:type="dxa" w:w="617"/>
+          </w:tcPr>
+          <w:p/>
+        </w:tc>
+        <w:tc>
+          <w:tcPr>
+            <w:tcW w:type="dxa" w:w="617"/>
+          </w:tcPr>
+          <w:p/>
+        </w:tc>
+        <w:tc>
+          <w:tcPr>
+            <w:tcW w:type="dxa" w:w="617"/>
+          </w:tcPr>
+          <w:p/>
+        </w:tc>
+        <w:tc>
+          <w:tcPr>
+            <w:tcW w:type="dxa" w:w="617"/>
+          </w:tcPr>
+          <w:p/>
+        </w:tc>
+        <w:tc>
+          <w:tcPr>
+            <w:tcW w:type="dxa" w:w="617"/>
+          </w:tcPr>
+          <w:p/>
+        </w:tc>
+        <w:tc>
+          <w:tcPr>
+            <w:tcW w:type="dxa" w:w="617"/>
+          </w:tcPr>
+          <w:p/>
+        </w:tc>
+        <w:tc>
+          <w:tcPr>
+            <w:tcW w:type="dxa" w:w="617"/>
+          </w:tcPr>
+          <w:p/>
+        </w:tc>
+        <w:tc>
+          <w:tcPr>
+            <w:tcW w:type="dxa" w:w="617"/>
+          </w:tcPr>
+          <w:p/>
+        </w:tc>
+        <w:tc>
+          <w:tcPr>
+            <w:tcW w:type="dxa" w:w="617"/>
+          </w:tcPr>
+          <w:p/>
+        </w:tc>
+        <w:tc>
+          <w:tcPr>
+            <w:tcW w:type="dxa" w:w="617"/>
+          </w:tcPr>
+          <w:p/>
+        </w:tc>
+        <w:tc>
+          <w:tcPr>
+            <w:tcW w:type="dxa" w:w="617"/>
+          </w:tcPr>
+          <w:p/>
+        </w:tc>
+        <w:tc>
+          <w:tcPr>
+            <w:tcW w:type="dxa" w:w="617"/>
+          </w:tcPr>
+          <w:p/>
+        </w:tc>
+        <w:tc>
+          <w:tcPr>
+            <w:tcW w:type="dxa" w:w="617"/>
+          </w:tcPr>
+          <w:p/>
+        </w:tc>
+        <w:tc>
+          <w:tcPr>
+            <w:tcW w:type="dxa" w:w="617"/>
+          </w:tcPr>
+          <w:p/>
+        </w:tc>
+      </w:tr>
+      <w:tr>
+        <w:tc>
+          <w:tcPr>
+            <w:tcW w:type="dxa" w:w="617"/>
+          </w:tcPr>
+          <w:p/>
+        </w:tc>
+        <w:tc>
+          <w:tcPr>
+            <w:tcW w:type="dxa" w:w="617"/>
+          </w:tcPr>
+          <w:p/>
+        </w:tc>
+        <w:tc>
+          <w:tcPr>
+            <w:tcW w:type="dxa" w:w="617"/>
+          </w:tcPr>
+          <w:p/>
+        </w:tc>
+        <w:tc>
+          <w:tcPr>
+            <w:tcW w:type="dxa" w:w="617"/>
+          </w:tcPr>
+          <w:p/>
+        </w:tc>
+        <w:tc>
+          <w:tcPr>
+            <w:tcW w:type="dxa" w:w="617"/>
+          </w:tcPr>
+          <w:p/>
+        </w:tc>
+        <w:tc>
+          <w:tcPr>
+            <w:tcW w:type="dxa" w:w="617"/>
+          </w:tcPr>
+          <w:p/>
+        </w:tc>
+        <w:tc>
+          <w:tcPr>
+            <w:tcW w:type="dxa" w:w="617"/>
+          </w:tcPr>
+          <w:p/>
+        </w:tc>
+        <w:tc>
+          <w:tcPr>
+            <w:tcW w:type="dxa" w:w="617"/>
+          </w:tcPr>
+          <w:p/>
+        </w:tc>
+        <w:tc>
+          <w:tcPr>
+            <w:tcW w:type="dxa" w:w="617"/>
+          </w:tcPr>
+          <w:p/>
+        </w:tc>
+        <w:tc>
+          <w:tcPr>
+            <w:tcW w:type="dxa" w:w="617"/>
+          </w:tcPr>
+          <w:p/>
+        </w:tc>
+        <w:tc>
+          <w:tcPr>
+            <w:tcW w:type="dxa" w:w="617"/>
+          </w:tcPr>
+          <w:p/>
+        </w:tc>
+        <w:tc>
+          <w:tcPr>
+            <w:tcW w:type="dxa" w:w="617"/>
+          </w:tcPr>
+          <w:p/>
+        </w:tc>
+        <w:tc>
+          <w:tcPr>
+            <w:tcW w:type="dxa" w:w="617"/>
+          </w:tcPr>
+          <w:p/>
+        </w:tc>
+        <w:tc>
+          <w:tcPr>
+            <w:tcW w:type="dxa" w:w="617"/>
+          </w:tcPr>
+          <w:p/>
+        </w:tc>
+      </w:tr>
+      <w:tr>
+        <w:tc>
+          <w:tcPr>
+            <w:tcW w:type="dxa" w:w="617"/>
+          </w:tcPr>
+          <w:p>
+            <w:r>
+              <w:rPr>
+                <w:b w:val="0"/>
+              </w:rPr>
+              <w:t>{#ds_nddpl_uy_quyen_chu_so_huu}{_stt}</w:t>
+            </w:r>
+          </w:p>
+        </w:tc>
+        <w:tc>
+          <w:tcPr>
+            <w:tcW w:type="dxa" w:w="617"/>
+          </w:tcPr>
+          <w:p>
+            <w:r>
+              <w:rPr>
+                <w:b w:val="0"/>
+              </w:rPr>
+              <w:t>{ten_nguoi_dai_dien}</w:t>
+            </w:r>
+          </w:p>
+        </w:tc>
+        <w:tc>
+          <w:tcPr>
+            <w:tcW w:type="dxa" w:w="617"/>
+          </w:tcPr>
+          <w:p>
+            <w:r>
+              <w:rPr>
+                <w:b w:val="0"/>
+              </w:rPr>
+              <w:t>{ngay_sinh}</w:t>
+            </w:r>
+          </w:p>
+        </w:tc>
+        <w:tc>
+          <w:tcPr>
+            <w:tcW w:type="dxa" w:w="617"/>
+          </w:tcPr>
+          <w:p>
+            <w:r>
+              <w:rPr>
+                <w:b w:val="0"/>
+              </w:rPr>
+              <w:t>{gioi_tinh}</w:t>
+            </w:r>
+          </w:p>
+        </w:tc>
+        <w:tc>
+          <w:tcPr>
+            <w:tcW w:type="dxa" w:w="617"/>
+          </w:tcPr>
+          <w:p>
+            <w:r>
+              <w:rPr>
+                <w:b w:val="0"/>
+              </w:rPr>
+              <w:t>{giay_to_so}</w:t>
+            </w:r>
+          </w:p>
+        </w:tc>
+        <w:tc>
+          <w:tcPr>
+            <w:tcW w:type="dxa" w:w="617"/>
+          </w:tcPr>
+          <w:p>
+            <w:r>
+              <w:rPr>
+                <w:b w:val="0"/>
+              </w:rPr>
+              <w:t>{giay_to_ngay}</w:t>
+            </w:r>
+          </w:p>
+        </w:tc>
+        <w:tc>
+          <w:tcPr>
+            <w:tcW w:type="dxa" w:w="617"/>
+          </w:tcPr>
+          <w:p>
+            <w:r>
+              <w:rPr>
+                <w:b w:val="0"/>
+              </w:rPr>
+              <w:t>{giay_to_co_quan}</w:t>
+            </w:r>
+          </w:p>
+        </w:tc>
+        <w:tc>
+          <w:tcPr>
+            <w:tcW w:type="dxa" w:w="617"/>
+          </w:tcPr>
+          <w:p>
+            <w:r>
+              <w:rPr>
+                <w:b w:val="0"/>
+              </w:rPr>
+              <w:t>{quoc_tich}</w:t>
+            </w:r>
+          </w:p>
+        </w:tc>
+        <w:tc>
+          <w:tcPr>
+            <w:tcW w:type="dxa" w:w="617"/>
+          </w:tcPr>
+          <w:p>
+            <w:r>
+              <w:rPr>
+                <w:b w:val="0"/>
+              </w:rPr>
+              <w:t>{dan_toc}</w:t>
+            </w:r>
+          </w:p>
+        </w:tc>
+        <w:tc>
+          <w:tcPr>
+            <w:tcW w:type="dxa" w:w="617"/>
+          </w:tcPr>
+          <w:p>
+            <w:r>
+              <w:rPr>
+                <w:b w:val="0"/>
+              </w:rPr>
+              <w:t>{dia_chi}</w:t>
+            </w:r>
+          </w:p>
+        </w:tc>
+        <w:tc>
+          <w:tcPr>
+            <w:tcW w:type="dxa" w:w="617"/>
+          </w:tcPr>
+          <w:p>
+            <w:r>
+              <w:rPr>
+                <w:b w:val="0"/>
+              </w:rPr>
+              <w:t>{von_duoc_uy_quyen_vnd}</w:t>
+            </w:r>
+          </w:p>
+        </w:tc>
+        <w:tc>
+          <w:tcPr>
+            <w:tcW w:type="dxa" w:w="617"/>
+          </w:tcPr>
+          <w:p>
+            <w:r>
+              <w:rPr>
+                <w:b w:val="0"/>
+              </w:rPr>
+              <w:t>{ty_le}</w:t>
+            </w:r>
+          </w:p>
+        </w:tc>
+        <w:tc>
+          <w:tcPr>
+            <w:tcW w:type="dxa" w:w="617"/>
+          </w:tcPr>
+          <w:p>
+            <w:r>
+              <w:rPr>
+                <w:b w:val="0"/>
+              </w:rPr>
+              <w:t>{chu_ky}</w:t>
+            </w:r>
+          </w:p>
+        </w:tc>
+        <w:tc>
+          <w:tcPr>
+            <w:tcW w:type="dxa" w:w="617"/>
+          </w:tcPr>
+          <w:p>
+            <w:r>
+              <w:rPr>
+                <w:b w:val="0"/>
+              </w:rPr>
+              <w:t>{ghi_chu}{/ds_nddpl_uy_quyen_chu_so_huu}</w:t>
+            </w:r>
+          </w:p>
+        </w:tc>
+      </w:tr>
+    </w:tbl>
+    <w:p/>
     <w:p>
       <w:pPr>
         <w:jc w:val="center"/>
@@ -3087,7 +4018,7 @@
           <w:sz w:val="24"/>
           <w:sz-cs w:val="24"/>
         </w:rPr>
-        <w:t xml:space="preserve">STTTên người đại diện theo pháp luật/người đại diện theo ủy quyềnNgày, tháng, năm sinhGiới tínhSố, ngày cấp, cơ quan cấp Giấy tờ pháp lý của cá nhân</w:t>
+        <w:t>- Thông tin về Giấy chứng nhận đăng ký đầu tư (chỉ kê khai nếu chủ sở hữu là nhà đầu tư nước ngoài):</w:t>
       </w:r>
       <w:r>
         <w:rPr>
@@ -3096,15 +4027,13 @@
           <w:sz-cs w:val="24"/>
           <w:vertAlign w:val="superscript"/>
         </w:rPr>
-        <w:t xml:space="preserve">5</w:t>
-      </w:r>
-      <w:r>
-        <w:rPr>
-          <w:rFonts w:ascii="Arial" w:hAnsi="Arial" w:cs="Arial"/>
-          <w:sz w:val="24"/>
-          <w:sz-cs w:val="24"/>
-        </w:rPr>
-        <w:t xml:space="preserve">Quốc tịchDân tộcĐịa chỉ liên lạcVốn được ủy quyền</w:t>
+      </w:r>
+      <w:r>
+        <w:rPr>
+          <w:rFonts w:ascii="Arial" w:hAnsi="Arial" w:cs="Arial"/>
+          <w:sz w:val="24"/>
+          <w:sz-cs w:val="24"/>
+        </w:rPr>
       </w:r>
       <w:r>
         <w:rPr>
@@ -3113,15 +4042,13 @@
           <w:sz-cs w:val="24"/>
           <w:vertAlign w:val="superscript"/>
         </w:rPr>
-        <w:t xml:space="preserve">6</w:t>
-      </w:r>
-      <w:r>
-        <w:rPr>
-          <w:rFonts w:ascii="Arial" w:hAnsi="Arial" w:cs="Arial"/>
-          <w:sz w:val="24"/>
-          <w:sz-cs w:val="24"/>
-        </w:rPr>
-        <w:t xml:space="preserve">Chữ ký của người đại diện theo pháp luật/người đại diện theo ủy quyền</w:t>
+      </w:r>
+      <w:r>
+        <w:rPr>
+          <w:rFonts w:ascii="Arial" w:hAnsi="Arial" w:cs="Arial"/>
+          <w:sz w:val="24"/>
+          <w:sz-cs w:val="24"/>
+        </w:rPr>
       </w:r>
       <w:r>
         <w:rPr>
@@ -3130,48 +4057,42 @@
           <w:sz-cs w:val="24"/>
           <w:vertAlign w:val="superscript"/>
         </w:rPr>
-        <w:t xml:space="preserve">8</w:t>
-      </w:r>
-      <w:r>
-        <w:rPr>
-          <w:rFonts w:ascii="Arial" w:hAnsi="Arial" w:cs="Arial"/>
-          <w:sz w:val="24"/>
-          <w:sz-cs w:val="24"/>
-        </w:rPr>
-        <w:t xml:space="preserve">Ghi chú (nếu có)</w:t>
-      </w:r>
-      <w:r>
-        <w:rPr>
-          <w:rFonts w:ascii="Arial" w:hAnsi="Arial" w:cs="Arial"/>
-          <w:sz w:val="24"/>
-          <w:sz-cs w:val="24"/>
-        </w:rPr>
-        <w:t xml:space="preserve"/>
-      </w:r>
-      <w:r>
-        <w:rPr>
-          <w:rFonts w:ascii="Arial" w:hAnsi="Arial" w:cs="Arial"/>
-          <w:sz w:val="24"/>
-          <w:sz-cs w:val="24"/>
-        </w:rPr>
-        <w:t xml:space="preserve">Tổng giá trị vốn được đại diện (</w:t>
-      </w:r>
-      <w:r>
-        <w:rPr>
-          <w:rFonts w:ascii="Arial" w:hAnsi="Arial" w:cs="Arial"/>
-          <w:sz w:val="24"/>
-          <w:sz-cs w:val="24"/>
-          <w:i/>
-        </w:rPr>
-        <w:t xml:space="preserve">bằng số; VNĐ và giá trị tương đương theo đơn vị tiền nước ngoài, nếu có)</w:t>
-      </w:r>
-      <w:r>
-        <w:rPr>
-          <w:rFonts w:ascii="Arial" w:hAnsi="Arial" w:cs="Arial"/>
-          <w:sz w:val="24"/>
-          <w:sz-cs w:val="24"/>
-        </w:rPr>
-        <w:t xml:space="preserve">Tỷ lệ</w:t>
+      </w:r>
+      <w:r>
+        <w:rPr>
+          <w:rFonts w:ascii="Arial" w:hAnsi="Arial" w:cs="Arial"/>
+          <w:sz w:val="24"/>
+          <w:sz-cs w:val="24"/>
+        </w:rPr>
+      </w:r>
+      <w:r>
+        <w:rPr>
+          <w:rFonts w:ascii="Arial" w:hAnsi="Arial" w:cs="Arial"/>
+          <w:sz w:val="24"/>
+          <w:sz-cs w:val="24"/>
+        </w:rPr>
+      </w:r>
+      <w:r>
+        <w:rPr>
+          <w:rFonts w:ascii="Arial" w:hAnsi="Arial" w:cs="Arial"/>
+          <w:sz w:val="24"/>
+          <w:sz-cs w:val="24"/>
+        </w:rPr>
+      </w:r>
+      <w:r>
+        <w:rPr>
+          <w:rFonts w:ascii="Arial" w:hAnsi="Arial" w:cs="Arial"/>
+          <w:sz w:val="24"/>
+          <w:sz-cs w:val="24"/>
+          <w:i/>
+        </w:rPr>
+      </w:r>
+      <w:r>
+        <w:rPr>
+          <w:rFonts w:ascii="Arial" w:hAnsi="Arial" w:cs="Arial"/>
+          <w:sz w:val="24"/>
+          <w:sz-cs w:val="24"/>
+        </w:rPr>
       </w:r>
       <w:r>
         <w:rPr>
@@ -3180,23 +4101,20 @@
           <w:sz-cs w:val="24"/>
           <w:vertAlign w:val="superscript"/>
         </w:rPr>
-        <w:t xml:space="preserve">7</w:t>
-      </w:r>
-      <w:r>
-        <w:rPr>
-          <w:rFonts w:ascii="Arial" w:hAnsi="Arial" w:cs="Arial"/>
-          <w:sz w:val="24"/>
-          <w:sz-cs w:val="24"/>
-        </w:rPr>
-        <w:t xml:space="preserve"> (%)Thời điểm đại diện phần vốn</w:t>
-      </w:r>
-      <w:r>
-        <w:rPr>
-          <w:rFonts w:ascii="Arial" w:hAnsi="Arial" w:cs="Arial"/>
-          <w:sz w:val="24"/>
-          <w:sz-cs w:val="24"/>
-        </w:rPr>
-        <w:t xml:space="preserve"/>
+      </w:r>
+      <w:r>
+        <w:rPr>
+          <w:rFonts w:ascii="Arial" w:hAnsi="Arial" w:cs="Arial"/>
+          <w:sz w:val="24"/>
+          <w:sz-cs w:val="24"/>
+        </w:rPr>
+      </w:r>
+      <w:r>
+        <w:rPr>
+          <w:rFonts w:ascii="Arial" w:hAnsi="Arial" w:cs="Arial"/>
+          <w:sz w:val="24"/>
+          <w:sz-cs w:val="24"/>
+        </w:rPr>
       </w:r>
       <w:r>
         <w:rPr>
@@ -3205,56 +4123,49 @@
           <w:sz-cs w:val="24"/>
           <w:b/>
         </w:rPr>
-        <w:t xml:space="preserve">12345678910111213</w:t>
-      </w:r>
-      <w:r>
-        <w:rPr>
-          <w:rFonts w:ascii="Arial" w:hAnsi="Arial" w:cs="Arial"/>
-          <w:sz w:val="24"/>
-          <w:sz-cs w:val="24"/>
-        </w:rPr>
-        <w:t xml:space="preserve"/>
-      </w:r>
-      <w:r>
-        <w:rPr>
-          <w:rFonts w:ascii="Arial" w:hAnsi="Arial" w:cs="Arial"/>
-          <w:sz w:val="24"/>
-          <w:sz-cs w:val="24"/>
-        </w:rPr>
-        <w:t xml:space="preserve"/>
-      </w:r>
-      <w:r>
-        <w:rPr>
-          <w:rFonts w:ascii="Arial" w:hAnsi="Arial" w:cs="Arial"/>
-          <w:sz w:val="24"/>
-          <w:sz-cs w:val="24"/>
-        </w:rPr>
-        <w:t xml:space="preserve"/>
-      </w:r>
-      <w:r>
-        <w:rPr>
-          <w:rFonts w:ascii="Arial" w:hAnsi="Arial" w:cs="Arial"/>
-          <w:sz w:val="24"/>
-          <w:sz-cs w:val="24"/>
-        </w:rPr>
-        <w:t xml:space="preserve">- Thông tin về Giấy chứng nhận đăng ký đầu tư (</w:t>
-      </w:r>
-      <w:r>
-        <w:rPr>
-          <w:rFonts w:ascii="Arial" w:hAnsi="Arial" w:cs="Arial"/>
-          <w:sz w:val="24"/>
-          <w:sz-cs w:val="24"/>
-          <w:i/>
-        </w:rPr>
-        <w:t xml:space="preserve">chỉ kê khai nếu chủ sở hữu là nhà đầu tư nước ngoài</w:t>
-      </w:r>
-      <w:r>
-        <w:rPr>
-          <w:rFonts w:ascii="Arial" w:hAnsi="Arial" w:cs="Arial"/>
-          <w:sz w:val="24"/>
-          <w:sz-cs w:val="24"/>
-        </w:rPr>
-        <w:t xml:space="preserve">):</w:t>
+      </w:r>
+      <w:r>
+        <w:rPr>
+          <w:rFonts w:ascii="Arial" w:hAnsi="Arial" w:cs="Arial"/>
+          <w:sz w:val="24"/>
+          <w:sz-cs w:val="24"/>
+        </w:rPr>
+      </w:r>
+      <w:r>
+        <w:rPr>
+          <w:rFonts w:ascii="Arial" w:hAnsi="Arial" w:cs="Arial"/>
+          <w:sz w:val="24"/>
+          <w:sz-cs w:val="24"/>
+        </w:rPr>
+      </w:r>
+      <w:r>
+        <w:rPr>
+          <w:rFonts w:ascii="Arial" w:hAnsi="Arial" w:cs="Arial"/>
+          <w:sz w:val="24"/>
+          <w:sz-cs w:val="24"/>
+        </w:rPr>
+      </w:r>
+      <w:r>
+        <w:rPr>
+          <w:rFonts w:ascii="Arial" w:hAnsi="Arial" w:cs="Arial"/>
+          <w:sz w:val="24"/>
+          <w:sz-cs w:val="24"/>
+        </w:rPr>
+      </w:r>
+      <w:r>
+        <w:rPr>
+          <w:rFonts w:ascii="Arial" w:hAnsi="Arial" w:cs="Arial"/>
+          <w:sz w:val="24"/>
+          <w:sz-cs w:val="24"/>
+          <w:i/>
+        </w:rPr>
+      </w:r>
+      <w:r>
+        <w:rPr>
+          <w:rFonts w:ascii="Arial" w:hAnsi="Arial" w:cs="Arial"/>
+          <w:sz w:val="24"/>
+          <w:sz-cs w:val="24"/>
+        </w:rPr>
       </w:r>
     </w:p>
     <w:p>
@@ -3280,7 +4191,7 @@
           <w:sz w:val="24"/>
           <w:sz-cs w:val="24"/>
         </w:rPr>
-        <w:t>Ngày cấp: {ndd.ngay_cap} Cơ quan cấp: {co_quan_cap}</w:t>
+        <w:t>Ngày cấp: {ngay_cap} Cơ quan cấp: {co_quan_cap}</w:t>
         <w:tab/>
       </w:r>
     </w:p>

</xml_diff>

<commit_message>
fix(wave-e): render section span dừng ở BẢNG CUỐI khi không có endMatch (mục 7/8-9 phục hồi không còn bị .dupe-anchor ẩn); process_checkboxes 2 pha + uniqueness key chk TẦM FORM (hết collision chéo, 0 đoạn dup trong blocks) — regen 7 form drift (M01/M02/M03/M04/M05/M12/M15), header_layout [FIELDS] 11/0, deep idempotency 17/0, numbering exit 0
</commit_message>
<xml_diff>
--- a/app/templates/PLI_M02.docx
+++ b/app/templates/PLI_M02.docx
@@ -2008,7 +2008,7 @@
           <w:sz w:val="24"/>
           <w:sz-cs w:val="24"/>
         </w:rPr>
-        <w:t>: Có {chk_khong} Không {chk_khong}</w:t>
+        <w:t>: Có {chk_auto_co} Không {chk_auto_khong}</w:t>
       </w:r>
     </w:p>
     <w:p>
@@ -4414,7 +4414,7 @@
           <w:sz w:val="24"/>
           <w:sz-cs w:val="24"/>
         </w:rPr>
-        <w:t xml:space="preserve">Có {chk_khong} Không </w:t>
+        <w:t xml:space="preserve">Có {chk_auto_co_2} Không </w:t>
       </w:r>
       <w:r>
         <w:rPr>
@@ -4423,7 +4423,7 @@
           <w:sz-cs w:val="24"/>
           <w:b/>
         </w:rPr>
-        <w:t>{chk_khong}</w:t>
+        <w:t>{chk_auto_khong_2}</w:t>
       </w:r>
     </w:p>
     <w:p>

</xml_diff>